<commit_message>
Actualizacion de 19 de Febrero
</commit_message>
<xml_diff>
--- a/Plantilla_Validacion.docx
+++ b/Plantilla_Validacion.docx
@@ -16986,7 +16986,45 @@
                 <w:sz w:val="18"/>
                 <w:szCs w:val="18"/>
               </w:rPr>
-              <w:t>Cumple</w:t>
+              <w:t>{{ ls_r_cumple }}</w:t>
+            </w:r>
+          </w:p>
+          <w:p>
+            <w:pPr>
+              <w:contextualSpacing/>
+              <w:jc w:val="center"/>
+              <w:rPr>
+                <w:rFonts w:ascii="Arial" w:hAnsi="Arial" w:cs="Arial"/>
+                <w:sz w:val="18"/>
+                <w:szCs w:val="18"/>
+              </w:rPr>
+            </w:pPr>
+            <w:r>
+              <w:rPr>
+                <w:rFonts w:ascii="Arial" w:hAnsi="Arial" w:cs="Arial"/>
+                <w:sz w:val="18"/>
+                <w:szCs w:val="18"/>
+              </w:rPr>
+              <w:t>{{ ls_err_cumple }}</w:t>
+            </w:r>
+          </w:p>
+          <w:p>
+            <w:pPr>
+              <w:contextualSpacing/>
+              <w:jc w:val="center"/>
+              <w:rPr>
+                <w:rFonts w:ascii="Arial" w:hAnsi="Arial" w:cs="Arial"/>
+                <w:sz w:val="18"/>
+                <w:szCs w:val="18"/>
+              </w:rPr>
+            </w:pPr>
+            <w:r>
+              <w:rPr>
+                <w:rFonts w:ascii="Arial" w:hAnsi="Arial" w:cs="Arial"/>
+                <w:sz w:val="18"/>
+                <w:szCs w:val="18"/>
+              </w:rPr>
+              <w:t>{{ ls_cv_cumple }}</w:t>
             </w:r>
           </w:p>
         </w:tc>
@@ -17333,282 +17371,21 @@
                 <w:sz w:val="18"/>
                 <w:szCs w:val="18"/>
               </w:rPr>
-              <w:t xml:space="preserve">{{ </w:t>
-            </w:r>
-            <w:r>
-              <w:rPr>
-                <w:rFonts w:ascii="Arial" w:hAnsi="Arial" w:cs="Arial"/>
-                <w:sz w:val="18"/>
-                <w:szCs w:val="18"/>
-              </w:rPr>
-              <w:t>if_acrodisco_1</w:t>
-            </w:r>
-            <w:r>
-              <w:rPr>
-                <w:rFonts w:ascii="Arial" w:hAnsi="Arial" w:cs="Arial"/>
-                <w:sz w:val="18"/>
-                <w:szCs w:val="18"/>
-              </w:rPr>
-              <w:t xml:space="preserve"> }}</w:t>
-            </w:r>
-            <w:r>
-              <w:rPr>
-                <w:rFonts w:ascii="Arial" w:hAnsi="Arial" w:cs="Arial"/>
-                <w:sz w:val="18"/>
-                <w:szCs w:val="18"/>
-              </w:rPr>
-              <w:t xml:space="preserve"> =</w:t>
-            </w:r>
-            <w:r>
-              <w:rPr>
-                <w:rFonts w:ascii="Arial" w:hAnsi="Arial" w:cs="Arial"/>
-                <w:sz w:val="18"/>
-                <w:szCs w:val="18"/>
-              </w:rPr>
-              <w:t xml:space="preserve"> {{ </w:t>
-            </w:r>
-            <w:r>
-              <w:rPr>
-                <w:rFonts w:ascii="Arial" w:hAnsi="Arial" w:cs="Arial"/>
-                <w:sz w:val="18"/>
-                <w:szCs w:val="18"/>
-              </w:rPr>
-              <w:t>if_diferencia_a_</w:t>
-            </w:r>
-            <w:r>
-              <w:rPr>
-                <w:rFonts w:ascii="Arial" w:hAnsi="Arial" w:cs="Arial"/>
-                <w:sz w:val="18"/>
-                <w:szCs w:val="18"/>
-              </w:rPr>
-              <w:t>1 }}</w:t>
-            </w:r>
-          </w:p>
-          <w:p>
-            <w:pPr>
-              <w:spacing w:line="276" w:lineRule="auto"/>
+              <w:t>{{ if_acrodisco_texto_limpio }}</w:t>
+            </w:r>
+          </w:p>
+        </w:tc>
+        <w:tc>
+          <w:tcPr>
+            <w:tcW w:w="1534" w:type="dxa"/>
+            <w:vAlign w:val="center"/>
+          </w:tcPr>
+          <w:p>
+            <w:pPr>
               <w:contextualSpacing/>
               <w:jc w:val="center"/>
               <w:rPr>
                 <w:rFonts w:ascii="Arial" w:hAnsi="Arial" w:cs="Arial"/>
-                <w:sz w:val="18"/>
-                <w:szCs w:val="18"/>
-              </w:rPr>
-            </w:pPr>
-            <w:r>
-              <w:rPr>
-                <w:rFonts w:ascii="Arial" w:hAnsi="Arial" w:cs="Arial"/>
-                <w:sz w:val="18"/>
-                <w:szCs w:val="18"/>
-              </w:rPr>
-              <w:t xml:space="preserve">{{ </w:t>
-            </w:r>
-            <w:r>
-              <w:rPr>
-                <w:rFonts w:ascii="Arial" w:hAnsi="Arial" w:cs="Arial"/>
-                <w:sz w:val="18"/>
-                <w:szCs w:val="18"/>
-              </w:rPr>
-              <w:t>if_acrodisco_</w:t>
-            </w:r>
-            <w:r>
-              <w:rPr>
-                <w:rFonts w:ascii="Arial" w:hAnsi="Arial" w:cs="Arial"/>
-                <w:sz w:val="18"/>
-                <w:szCs w:val="18"/>
-              </w:rPr>
-              <w:t>2 }}</w:t>
-            </w:r>
-            <w:r>
-              <w:rPr>
-                <w:rFonts w:ascii="Arial" w:hAnsi="Arial" w:cs="Arial"/>
-                <w:sz w:val="18"/>
-                <w:szCs w:val="18"/>
-              </w:rPr>
-              <w:t xml:space="preserve"> = </w:t>
-            </w:r>
-            <w:r>
-              <w:rPr>
-                <w:rFonts w:ascii="Arial" w:hAnsi="Arial" w:cs="Arial"/>
-                <w:sz w:val="18"/>
-                <w:szCs w:val="18"/>
-              </w:rPr>
-              <w:t xml:space="preserve">{{ </w:t>
-            </w:r>
-            <w:r>
-              <w:rPr>
-                <w:rFonts w:ascii="Arial" w:hAnsi="Arial" w:cs="Arial"/>
-                <w:sz w:val="18"/>
-                <w:szCs w:val="18"/>
-              </w:rPr>
-              <w:t>if_diferencia_a_2</w:t>
-            </w:r>
-            <w:r>
-              <w:rPr>
-                <w:rFonts w:ascii="Arial" w:hAnsi="Arial" w:cs="Arial"/>
-                <w:sz w:val="18"/>
-                <w:szCs w:val="18"/>
-              </w:rPr>
-              <w:t xml:space="preserve"> }}</w:t>
-            </w:r>
-          </w:p>
-          <w:p>
-            <w:pPr>
-              <w:spacing w:line="276" w:lineRule="auto"/>
-              <w:contextualSpacing/>
-              <w:jc w:val="center"/>
-              <w:rPr>
-                <w:rFonts w:ascii="Arial" w:hAnsi="Arial" w:cs="Arial"/>
-                <w:sz w:val="18"/>
-                <w:szCs w:val="18"/>
-              </w:rPr>
-            </w:pPr>
-            <w:r>
-              <w:rPr>
-                <w:rFonts w:ascii="Arial" w:hAnsi="Arial" w:cs="Arial"/>
-                <w:sz w:val="18"/>
-                <w:szCs w:val="18"/>
-              </w:rPr>
-              <w:t xml:space="preserve">{{ </w:t>
-            </w:r>
-            <w:r>
-              <w:rPr>
-                <w:rFonts w:ascii="Arial" w:hAnsi="Arial" w:cs="Arial"/>
-                <w:sz w:val="18"/>
-                <w:szCs w:val="18"/>
-              </w:rPr>
-              <w:t>if_acrodisco_</w:t>
-            </w:r>
-            <w:r>
-              <w:rPr>
-                <w:rFonts w:ascii="Arial" w:hAnsi="Arial" w:cs="Arial"/>
-                <w:sz w:val="18"/>
-                <w:szCs w:val="18"/>
-              </w:rPr>
-              <w:t xml:space="preserve">3 }} = {{ </w:t>
-            </w:r>
-            <w:r>
-              <w:rPr>
-                <w:rFonts w:ascii="Arial" w:hAnsi="Arial" w:cs="Arial"/>
-                <w:sz w:val="18"/>
-                <w:szCs w:val="18"/>
-              </w:rPr>
-              <w:t>if_diferencia_a_</w:t>
-            </w:r>
-            <w:r>
-              <w:rPr>
-                <w:rFonts w:ascii="Arial" w:hAnsi="Arial" w:cs="Arial"/>
-                <w:sz w:val="18"/>
-                <w:szCs w:val="18"/>
-              </w:rPr>
-              <w:t>3 }}</w:t>
-            </w:r>
-          </w:p>
-          <w:p>
-            <w:pPr>
-              <w:spacing w:line="276" w:lineRule="auto"/>
-              <w:contextualSpacing/>
-              <w:jc w:val="center"/>
-              <w:rPr>
-                <w:rFonts w:ascii="Arial" w:hAnsi="Arial" w:cs="Arial"/>
-                <w:sz w:val="18"/>
-                <w:szCs w:val="18"/>
-              </w:rPr>
-            </w:pPr>
-            <w:r>
-              <w:rPr>
-                <w:rFonts w:ascii="Arial" w:hAnsi="Arial" w:cs="Arial"/>
-                <w:sz w:val="18"/>
-                <w:szCs w:val="18"/>
-              </w:rPr>
-              <w:t xml:space="preserve">{{ </w:t>
-            </w:r>
-            <w:r>
-              <w:rPr>
-                <w:rFonts w:ascii="Arial" w:hAnsi="Arial" w:cs="Arial"/>
-                <w:sz w:val="18"/>
-                <w:szCs w:val="18"/>
-              </w:rPr>
-              <w:t>if_acrodisco_</w:t>
-            </w:r>
-            <w:r>
-              <w:rPr>
-                <w:rFonts w:ascii="Arial" w:hAnsi="Arial" w:cs="Arial"/>
-                <w:sz w:val="18"/>
-                <w:szCs w:val="18"/>
-              </w:rPr>
-              <w:t xml:space="preserve">4 }} = {{ </w:t>
-            </w:r>
-            <w:r>
-              <w:rPr>
-                <w:rFonts w:ascii="Arial" w:hAnsi="Arial" w:cs="Arial"/>
-                <w:sz w:val="18"/>
-                <w:szCs w:val="18"/>
-              </w:rPr>
-              <w:t>if_diferencia_a_</w:t>
-            </w:r>
-            <w:r>
-              <w:rPr>
-                <w:rFonts w:ascii="Arial" w:hAnsi="Arial" w:cs="Arial"/>
-                <w:sz w:val="18"/>
-                <w:szCs w:val="18"/>
-              </w:rPr>
-              <w:t>4 }}</w:t>
-            </w:r>
-            <w:r>
-              <w:rPr>
-                <w:rFonts w:ascii="Arial" w:hAnsi="Arial" w:cs="Arial"/>
-                <w:sz w:val="18"/>
-                <w:szCs w:val="18"/>
-              </w:rPr>
-              <w:br/>
-              <w:t xml:space="preserve">{{ </w:t>
-            </w:r>
-            <w:r>
-              <w:rPr>
-                <w:rFonts w:ascii="Arial" w:hAnsi="Arial" w:cs="Arial"/>
-                <w:sz w:val="18"/>
-                <w:szCs w:val="18"/>
-              </w:rPr>
-              <w:t>if_acrodisco_</w:t>
-            </w:r>
-            <w:r>
-              <w:rPr>
-                <w:rFonts w:ascii="Arial" w:hAnsi="Arial" w:cs="Arial"/>
-                <w:sz w:val="18"/>
-                <w:szCs w:val="18"/>
-              </w:rPr>
-              <w:t xml:space="preserve">5 }} = {{ </w:t>
-            </w:r>
-            <w:r>
-              <w:rPr>
-                <w:rFonts w:ascii="Arial" w:hAnsi="Arial" w:cs="Arial"/>
-                <w:sz w:val="18"/>
-                <w:szCs w:val="18"/>
-              </w:rPr>
-              <w:t>if_diferencia_a_</w:t>
-            </w:r>
-            <w:r>
-              <w:rPr>
-                <w:rFonts w:ascii="Arial" w:hAnsi="Arial" w:cs="Arial"/>
-                <w:sz w:val="18"/>
-                <w:szCs w:val="18"/>
-              </w:rPr>
-              <w:t>5 }}</w:t>
-            </w:r>
-          </w:p>
-        </w:tc>
-        <w:tc>
-          <w:tcPr>
-            <w:tcW w:w="1534" w:type="dxa"/>
-            <w:vAlign w:val="center"/>
-          </w:tcPr>
-          <w:p>
-            <w:pPr>
-              <w:contextualSpacing/>
-              <w:jc w:val="center"/>
-              <w:rPr>
-                <w:rFonts w:ascii="Arial" w:hAnsi="Arial" w:cs="Arial"/>
                 <w:color w:val="FF0000"/>
                 <w:sz w:val="18"/>
                 <w:szCs w:val="18"/>
@@ -17620,7 +17397,7 @@
                 <w:sz w:val="18"/>
                 <w:szCs w:val="18"/>
               </w:rPr>
-              <w:t>Cumple</w:t>
+              <w:t>{{ if_acrodisco_cumple }}</w:t>
             </w:r>
           </w:p>
         </w:tc>
@@ -17690,60 +17467,17 @@
                 <w:sz w:val="18"/>
                 <w:szCs w:val="18"/>
               </w:rPr>
-              <w:t xml:space="preserve">{{ </w:t>
-            </w:r>
-            <w:r>
-              <w:rPr>
-                <w:rFonts w:ascii="Arial" w:hAnsi="Arial" w:cs="Arial"/>
-                <w:sz w:val="18"/>
-                <w:szCs w:val="18"/>
-              </w:rPr>
-              <w:t>if_canula_1</w:t>
-            </w:r>
-            <w:r>
-              <w:rPr>
-                <w:rFonts w:ascii="Arial" w:hAnsi="Arial" w:cs="Arial"/>
-                <w:sz w:val="18"/>
-                <w:szCs w:val="18"/>
-              </w:rPr>
-              <w:t xml:space="preserve"> }}</w:t>
-            </w:r>
-            <w:r>
-              <w:rPr>
-                <w:rFonts w:ascii="Arial" w:hAnsi="Arial" w:cs="Arial"/>
-                <w:sz w:val="18"/>
-                <w:szCs w:val="18"/>
-              </w:rPr>
-              <w:t xml:space="preserve"> = </w:t>
-            </w:r>
-            <w:r>
-              <w:rPr>
-                <w:rFonts w:ascii="Arial" w:hAnsi="Arial" w:cs="Arial"/>
-                <w:sz w:val="18"/>
-                <w:szCs w:val="18"/>
-              </w:rPr>
-              <w:t xml:space="preserve">{{ </w:t>
-            </w:r>
-            <w:r>
-              <w:rPr>
-                <w:rFonts w:ascii="Arial" w:hAnsi="Arial" w:cs="Arial"/>
-                <w:sz w:val="18"/>
-                <w:szCs w:val="18"/>
-              </w:rPr>
-              <w:t>if_diferencia_c_1</w:t>
-            </w:r>
-            <w:r>
-              <w:rPr>
-                <w:rFonts w:ascii="Arial" w:hAnsi="Arial" w:cs="Arial"/>
-                <w:sz w:val="18"/>
-                <w:szCs w:val="18"/>
-              </w:rPr>
-              <w:t xml:space="preserve"> }}</w:t>
-            </w:r>
-          </w:p>
-          <w:p>
-            <w:pPr>
-              <w:spacing w:line="276" w:lineRule="auto"/>
+              <w:t>{{ if_canula_texto_limpio }}</w:t>
+            </w:r>
+          </w:p>
+        </w:tc>
+        <w:tc>
+          <w:tcPr>
+            <w:tcW w:w="1534" w:type="dxa"/>
+            <w:vAlign w:val="center"/>
+          </w:tcPr>
+          <w:p>
+            <w:pPr>
               <w:contextualSpacing/>
               <w:jc w:val="center"/>
               <w:rPr>
@@ -17758,220 +17492,7 @@
                 <w:sz w:val="18"/>
                 <w:szCs w:val="18"/>
               </w:rPr>
-              <w:t xml:space="preserve">{{ </w:t>
-            </w:r>
-            <w:r>
-              <w:rPr>
-                <w:rFonts w:ascii="Arial" w:hAnsi="Arial" w:cs="Arial"/>
-                <w:sz w:val="18"/>
-                <w:szCs w:val="18"/>
-              </w:rPr>
-              <w:t>if_canula_</w:t>
-            </w:r>
-            <w:r>
-              <w:rPr>
-                <w:rFonts w:ascii="Arial" w:hAnsi="Arial" w:cs="Arial"/>
-                <w:sz w:val="18"/>
-                <w:szCs w:val="18"/>
-              </w:rPr>
-              <w:t xml:space="preserve">2 }} = {{ </w:t>
-            </w:r>
-            <w:r>
-              <w:rPr>
-                <w:rFonts w:ascii="Arial" w:hAnsi="Arial" w:cs="Arial"/>
-                <w:sz w:val="18"/>
-                <w:szCs w:val="18"/>
-              </w:rPr>
-              <w:t>if_diferencia_c_</w:t>
-            </w:r>
-            <w:r>
-              <w:rPr>
-                <w:rFonts w:ascii="Arial" w:hAnsi="Arial" w:cs="Arial"/>
-                <w:sz w:val="18"/>
-                <w:szCs w:val="18"/>
-              </w:rPr>
-              <w:t>2 }}</w:t>
-            </w:r>
-          </w:p>
-          <w:p>
-            <w:pPr>
-              <w:spacing w:line="276" w:lineRule="auto"/>
-              <w:contextualSpacing/>
-              <w:jc w:val="center"/>
-              <w:rPr>
-                <w:rFonts w:ascii="Arial" w:hAnsi="Arial" w:cs="Arial"/>
-                <w:sz w:val="18"/>
-                <w:szCs w:val="18"/>
-              </w:rPr>
-            </w:pPr>
-            <w:r>
-              <w:rPr>
-                <w:rFonts w:ascii="Arial" w:hAnsi="Arial" w:cs="Arial"/>
-                <w:sz w:val="18"/>
-                <w:szCs w:val="18"/>
-              </w:rPr>
-              <w:t xml:space="preserve">{{ </w:t>
-            </w:r>
-            <w:r>
-              <w:rPr>
-                <w:rFonts w:ascii="Arial" w:hAnsi="Arial" w:cs="Arial"/>
-                <w:sz w:val="18"/>
-                <w:szCs w:val="18"/>
-              </w:rPr>
-              <w:t>if_canula_</w:t>
-            </w:r>
-            <w:r>
-              <w:rPr>
-                <w:rFonts w:ascii="Arial" w:hAnsi="Arial" w:cs="Arial"/>
-                <w:sz w:val="18"/>
-                <w:szCs w:val="18"/>
-              </w:rPr>
-              <w:t xml:space="preserve">3 }} = {{ </w:t>
-            </w:r>
-            <w:r>
-              <w:rPr>
-                <w:rFonts w:ascii="Arial" w:hAnsi="Arial" w:cs="Arial"/>
-                <w:sz w:val="18"/>
-                <w:szCs w:val="18"/>
-              </w:rPr>
-              <w:t>if_diferencia_c_</w:t>
-            </w:r>
-            <w:r>
-              <w:rPr>
-                <w:rFonts w:ascii="Arial" w:hAnsi="Arial" w:cs="Arial"/>
-                <w:sz w:val="18"/>
-                <w:szCs w:val="18"/>
-              </w:rPr>
-              <w:t>3 }}</w:t>
-            </w:r>
-          </w:p>
-          <w:p>
-            <w:pPr>
-              <w:spacing w:line="276" w:lineRule="auto"/>
-              <w:contextualSpacing/>
-              <w:jc w:val="center"/>
-              <w:rPr>
-                <w:rFonts w:ascii="Arial" w:hAnsi="Arial" w:cs="Arial"/>
-                <w:sz w:val="18"/>
-                <w:szCs w:val="18"/>
-              </w:rPr>
-            </w:pPr>
-            <w:r>
-              <w:rPr>
-                <w:rFonts w:ascii="Arial" w:hAnsi="Arial" w:cs="Arial"/>
-                <w:sz w:val="18"/>
-                <w:szCs w:val="18"/>
-              </w:rPr>
-              <w:t xml:space="preserve">{{ </w:t>
-            </w:r>
-            <w:r>
-              <w:rPr>
-                <w:rFonts w:ascii="Arial" w:hAnsi="Arial" w:cs="Arial"/>
-                <w:sz w:val="18"/>
-                <w:szCs w:val="18"/>
-              </w:rPr>
-              <w:t>if_canula_</w:t>
-            </w:r>
-            <w:r>
-              <w:rPr>
-                <w:rFonts w:ascii="Arial" w:hAnsi="Arial" w:cs="Arial"/>
-                <w:sz w:val="18"/>
-                <w:szCs w:val="18"/>
-              </w:rPr>
-              <w:t xml:space="preserve">4 }} = {{ </w:t>
-            </w:r>
-            <w:r>
-              <w:rPr>
-                <w:rFonts w:ascii="Arial" w:hAnsi="Arial" w:cs="Arial"/>
-                <w:sz w:val="18"/>
-                <w:szCs w:val="18"/>
-              </w:rPr>
-              <w:t>if_diferencia_c_</w:t>
-            </w:r>
-            <w:r>
-              <w:rPr>
-                <w:rFonts w:ascii="Arial" w:hAnsi="Arial" w:cs="Arial"/>
-                <w:sz w:val="18"/>
-                <w:szCs w:val="18"/>
-              </w:rPr>
-              <w:t>4 }}</w:t>
-            </w:r>
-          </w:p>
-          <w:p>
-            <w:pPr>
-              <w:spacing w:line="276" w:lineRule="auto"/>
-              <w:contextualSpacing/>
-              <w:jc w:val="center"/>
-              <w:rPr>
-                <w:rFonts w:ascii="Arial" w:hAnsi="Arial" w:cs="Arial"/>
-                <w:sz w:val="18"/>
-                <w:szCs w:val="18"/>
-              </w:rPr>
-            </w:pPr>
-            <w:r>
-              <w:rPr>
-                <w:rFonts w:ascii="Arial" w:hAnsi="Arial" w:cs="Arial"/>
-                <w:sz w:val="18"/>
-                <w:szCs w:val="18"/>
-              </w:rPr>
-              <w:t xml:space="preserve">{{ </w:t>
-            </w:r>
-            <w:r>
-              <w:rPr>
-                <w:rFonts w:ascii="Arial" w:hAnsi="Arial" w:cs="Arial"/>
-                <w:sz w:val="18"/>
-                <w:szCs w:val="18"/>
-              </w:rPr>
-              <w:t>if_canula_</w:t>
-            </w:r>
-            <w:r>
-              <w:rPr>
-                <w:rFonts w:ascii="Arial" w:hAnsi="Arial" w:cs="Arial"/>
-                <w:sz w:val="18"/>
-                <w:szCs w:val="18"/>
-              </w:rPr>
-              <w:t xml:space="preserve">5 }} = {{ </w:t>
-            </w:r>
-            <w:r>
-              <w:rPr>
-                <w:rFonts w:ascii="Arial" w:hAnsi="Arial" w:cs="Arial"/>
-                <w:sz w:val="18"/>
-                <w:szCs w:val="18"/>
-              </w:rPr>
-              <w:t>if_diferencia_c_</w:t>
-            </w:r>
-            <w:r>
-              <w:rPr>
-                <w:rFonts w:ascii="Arial" w:hAnsi="Arial" w:cs="Arial"/>
-                <w:sz w:val="18"/>
-                <w:szCs w:val="18"/>
-              </w:rPr>
-              <w:t>5 }}</w:t>
-            </w:r>
-          </w:p>
-        </w:tc>
-        <w:tc>
-          <w:tcPr>
-            <w:tcW w:w="1534" w:type="dxa"/>
-            <w:vAlign w:val="center"/>
-          </w:tcPr>
-          <w:p>
-            <w:pPr>
-              <w:contextualSpacing/>
-              <w:jc w:val="center"/>
-              <w:rPr>
-                <w:rFonts w:ascii="Arial" w:hAnsi="Arial" w:cs="Arial"/>
-                <w:sz w:val="18"/>
-                <w:szCs w:val="18"/>
-              </w:rPr>
-            </w:pPr>
-            <w:r>
-              <w:rPr>
-                <w:rFonts w:ascii="Arial" w:hAnsi="Arial" w:cs="Arial"/>
-                <w:sz w:val="18"/>
-                <w:szCs w:val="18"/>
-              </w:rPr>
-              <w:t>No cumple</w:t>
+              <w:t>{{ if_canula_cumple }}</w:t>
             </w:r>
           </w:p>
         </w:tc>
@@ -18133,7 +17654,7 @@
                 <w:sz w:val="18"/>
                 <w:szCs w:val="18"/>
               </w:rPr>
-              <w:t>Cumple</w:t>
+              <w:t>{{ est_ea_cumple }}</w:t>
             </w:r>
           </w:p>
         </w:tc>
@@ -18345,7 +17866,7 @@
                 <w:sz w:val="18"/>
                 <w:szCs w:val="18"/>
               </w:rPr>
-              <w:t>Cumple</w:t>
+              <w:t>{{ est_eau_cumple }}</w:t>
             </w:r>
           </w:p>
         </w:tc>
@@ -18494,7 +18015,7 @@
                 <w:sz w:val="18"/>
                 <w:szCs w:val="18"/>
               </w:rPr>
-              <w:t>Cumple</w:t>
+              <w:t>{{ est_er_cumple }}</w:t>
             </w:r>
           </w:p>
         </w:tc>
@@ -18642,15 +18163,7 @@
                 <w:sz w:val="18"/>
                 <w:szCs w:val="18"/>
               </w:rPr>
-              <w:t xml:space="preserve">No </w:t>
-            </w:r>
-            <w:r>
-              <w:rPr>
-                <w:rFonts w:ascii="Arial" w:hAnsi="Arial" w:cs="Arial"/>
-                <w:sz w:val="18"/>
-                <w:szCs w:val="18"/>
-              </w:rPr>
-              <w:t>Cumple</w:t>
+              <w:t>{{ est_ess_cumple }}</w:t>
             </w:r>
           </w:p>
         </w:tc>
@@ -18682,7 +18195,6 @@
                 <w:sz w:val="18"/>
                 <w:szCs w:val="18"/>
               </w:rPr>
-              <w:lastRenderedPageBreak/>
               <w:t>Linealidad del Método para el Medicamento de Referencia</w:t>
             </w:r>
           </w:p>
@@ -18867,6 +18379,27 @@
                 <w:rFonts w:ascii="Arial" w:hAnsi="Arial" w:cs="Arial"/>
                 <w:sz w:val="18"/>
                 <w:szCs w:val="18"/>
+              </w:rPr>
+            </w:pPr>
+            <w:r>
+              <w:rPr>
+                <w:rFonts w:ascii="Arial" w:hAnsi="Arial" w:cs="Arial"/>
+                <w:sz w:val="18"/>
+                <w:szCs w:val="18"/>
+              </w:rPr>
+              <w:t>{{ lm_r_ref_cumple }}</w:t>
+            </w:r>
+          </w:p>
+          <w:p>
+            <w:pPr>
+              <w:spacing w:line="360" w:lineRule="auto"/>
+              <w:ind w:right="72"/>
+              <w:contextualSpacing/>
+              <w:jc w:val="center"/>
+              <w:rPr>
+                <w:rFonts w:ascii="Arial" w:hAnsi="Arial" w:cs="Arial"/>
+                <w:sz w:val="18"/>
+                <w:szCs w:val="18"/>
                 <w:lang w:val="en-US"/>
               </w:rPr>
             </w:pPr>
@@ -18875,9 +18408,8 @@
                 <w:rFonts w:ascii="Arial" w:hAnsi="Arial" w:cs="Arial"/>
                 <w:sz w:val="18"/>
                 <w:szCs w:val="18"/>
-                <w:lang w:val="en-US"/>
-              </w:rPr>
-              <w:t>Cumple</w:t>
+              </w:rPr>
+              <w:t>{{ lm_err_ref_cumple }}</w:t>
             </w:r>
           </w:p>
         </w:tc>
@@ -18909,6 +18441,7 @@
                 <w:sz w:val="18"/>
                 <w:szCs w:val="18"/>
               </w:rPr>
+              <w:lastRenderedPageBreak/>
               <w:t>Linealidad del Método para el Medicamento de Prueba</w:t>
             </w:r>
           </w:p>
@@ -19093,6 +18626,27 @@
                 <w:rFonts w:ascii="Arial" w:hAnsi="Arial" w:cs="Arial"/>
                 <w:sz w:val="18"/>
                 <w:szCs w:val="18"/>
+              </w:rPr>
+            </w:pPr>
+            <w:r>
+              <w:rPr>
+                <w:rFonts w:ascii="Arial" w:hAnsi="Arial" w:cs="Arial"/>
+                <w:sz w:val="18"/>
+                <w:szCs w:val="18"/>
+              </w:rPr>
+              <w:t>{{ lm_r_pba_cumple }}</w:t>
+            </w:r>
+          </w:p>
+          <w:p>
+            <w:pPr>
+              <w:spacing w:line="360" w:lineRule="auto"/>
+              <w:ind w:right="72"/>
+              <w:contextualSpacing/>
+              <w:jc w:val="center"/>
+              <w:rPr>
+                <w:rFonts w:ascii="Arial" w:hAnsi="Arial" w:cs="Arial"/>
+                <w:sz w:val="18"/>
+                <w:szCs w:val="18"/>
                 <w:lang w:val="en-US"/>
               </w:rPr>
             </w:pPr>
@@ -19101,9 +18655,8 @@
                 <w:rFonts w:ascii="Arial" w:hAnsi="Arial" w:cs="Arial"/>
                 <w:sz w:val="18"/>
                 <w:szCs w:val="18"/>
-                <w:lang w:val="en-US"/>
-              </w:rPr>
-              <w:t>Cumple</w:t>
+              </w:rPr>
+              <w:t>{{ lm_err_pba_cumple }}</w:t>
             </w:r>
           </w:p>
         </w:tc>
@@ -19272,7 +18825,7 @@
                 <w:sz w:val="18"/>
                 <w:szCs w:val="18"/>
               </w:rPr>
-              <w:t>Cumple</w:t>
+              <w:t>{{ exactitud_ref_cumple }}</w:t>
             </w:r>
           </w:p>
         </w:tc>
@@ -20586,7 +20139,7 @@
                 <w:sz w:val="18"/>
                 <w:szCs w:val="18"/>
               </w:rPr>
-              <w:t>Cumple</w:t>
+              <w:t>{{ exactitud_pba_cumple }}</w:t>
             </w:r>
           </w:p>
         </w:tc>
@@ -21867,7 +21420,7 @@
                 <w:sz w:val="18"/>
                 <w:szCs w:val="18"/>
               </w:rPr>
-              <w:t>Cumple</w:t>
+              <w:t>{{ lm_cv_ref_cumple }}</w:t>
             </w:r>
           </w:p>
         </w:tc>
@@ -22015,7 +21568,7 @@
                 <w:sz w:val="18"/>
                 <w:szCs w:val="18"/>
               </w:rPr>
-              <w:t>Cumple</w:t>
+              <w:t>{{ r_cv_ref_cumple }}</w:t>
             </w:r>
           </w:p>
         </w:tc>
@@ -22166,7 +21719,7 @@
                 <w:sz w:val="18"/>
                 <w:szCs w:val="18"/>
               </w:rPr>
-              <w:t>Cumple</w:t>
+              <w:t>{{ lm_cv_pba_cumple }}</w:t>
             </w:r>
           </w:p>
         </w:tc>
@@ -22309,7 +21862,7 @@
                 <w:sz w:val="18"/>
                 <w:szCs w:val="18"/>
               </w:rPr>
-              <w:t>Cumple</w:t>
+              <w:t>{{ r_cv_pba_cumple }}</w:t>
             </w:r>
           </w:p>
         </w:tc>
@@ -22424,7 +21977,7 @@
                 <w:sz w:val="18"/>
                 <w:szCs w:val="18"/>
               </w:rPr>
-              <w:t>Cumple</w:t>
+              <w:t>{{ selectividad_referencia_cumple }}</w:t>
             </w:r>
           </w:p>
         </w:tc>
@@ -22877,7 +22430,7 @@
                 <w:sz w:val="18"/>
                 <w:szCs w:val="18"/>
               </w:rPr>
-              <w:t>Cumple</w:t>
+              <w:t>{{ selectividad_prueba_cumple }}</w:t>
             </w:r>
           </w:p>
         </w:tc>
@@ -27691,7 +27244,6 @@
   <w:style w:type="character" w:default="1" w:styleId="Fuentedeprrafopredeter">
     <w:name w:val="Default Paragraph Font"/>
     <w:uiPriority w:val="1"/>
-    <w:semiHidden/>
     <w:unhideWhenUsed/>
   </w:style>
   <w:style w:type="table" w:default="1" w:styleId="Tablanormal">
@@ -28640,6 +28192,23 @@
 </file>
 
 <file path=customXml/item2.xml><?xml version="1.0" encoding="utf-8"?>
+<b:Sources xmlns:b="http://schemas.openxmlformats.org/officeDocument/2006/bibliography" xmlns="http://schemas.openxmlformats.org/officeDocument/2006/bibliography" SelectedStyle="\APASixthEditionOfficeOnline.xsl" StyleName="APA Sixth Edition"/>
+</file>
+
+<file path=customXml/item3.xml><?xml version="1.0" encoding="utf-8"?>
+<p:properties xmlns:p="http://schemas.microsoft.com/office/2006/metadata/properties" xmlns:xsi="http://www.w3.org/2001/XMLSchema-instance" xmlns:pc="http://schemas.microsoft.com/office/infopath/2007/PartnerControls">
+  <documentManagement>
+    <TaxCatchAll xmlns="b03f722e-823d-4c29-84d1-8c55babf561e" xsi:nil="true"/>
+    <lcf76f155ced4ddcb4097134ff3c332f xmlns="611838d7-16b7-40e6-873b-7ca3491b508c">
+      <Terms xmlns="http://schemas.microsoft.com/office/infopath/2007/PartnerControls"/>
+    </lcf76f155ced4ddcb4097134ff3c332f>
+    <_ip_UnifiedCompliancePolicyUIAction xmlns="http://schemas.microsoft.com/sharepoint/v3" xsi:nil="true"/>
+    <_ip_UnifiedCompliancePolicyProperties xmlns="http://schemas.microsoft.com/sharepoint/v3" xsi:nil="true"/>
+  </documentManagement>
+</p:properties>
+</file>
+
+<file path=customXml/item4.xml><?xml version="1.0" encoding="utf-8"?>
 <ct:contentTypeSchema xmlns:ct="http://schemas.microsoft.com/office/2006/metadata/contentType" xmlns:ma="http://schemas.microsoft.com/office/2006/metadata/properties/metaAttributes" ct:_="" ma:_="" ma:contentTypeName="Documento" ma:contentTypeID="0x0101005D40C0DC442AEA468E3732DF44270B24" ma:contentTypeVersion="17" ma:contentTypeDescription="Crear nuevo documento." ma:contentTypeScope="" ma:versionID="03bd8c16e918cbacdda7848d867856c0">
   <xsd:schema xmlns:xsd="http://www.w3.org/2001/XMLSchema" xmlns:xs="http://www.w3.org/2001/XMLSchema" xmlns:p="http://schemas.microsoft.com/office/2006/metadata/properties" xmlns:ns1="http://schemas.microsoft.com/sharepoint/v3" xmlns:ns2="611838d7-16b7-40e6-873b-7ca3491b508c" xmlns:ns3="b03f722e-823d-4c29-84d1-8c55babf561e" targetNamespace="http://schemas.microsoft.com/office/2006/metadata/properties" ma:root="true" ma:fieldsID="811e76fb1bc4d7e0c7d13013ec5d66c3" ns1:_="" ns2:_="" ns3:_="">
     <xsd:import namespace="http://schemas.microsoft.com/sharepoint/v3"/>
@@ -28891,23 +28460,6 @@
 </ct:contentTypeSchema>
 </file>
 
-<file path=customXml/item3.xml><?xml version="1.0" encoding="utf-8"?>
-<p:properties xmlns:p="http://schemas.microsoft.com/office/2006/metadata/properties" xmlns:xsi="http://www.w3.org/2001/XMLSchema-instance" xmlns:pc="http://schemas.microsoft.com/office/infopath/2007/PartnerControls">
-  <documentManagement>
-    <TaxCatchAll xmlns="b03f722e-823d-4c29-84d1-8c55babf561e" xsi:nil="true"/>
-    <lcf76f155ced4ddcb4097134ff3c332f xmlns="611838d7-16b7-40e6-873b-7ca3491b508c">
-      <Terms xmlns="http://schemas.microsoft.com/office/infopath/2007/PartnerControls"/>
-    </lcf76f155ced4ddcb4097134ff3c332f>
-    <_ip_UnifiedCompliancePolicyUIAction xmlns="http://schemas.microsoft.com/sharepoint/v3" xsi:nil="true"/>
-    <_ip_UnifiedCompliancePolicyProperties xmlns="http://schemas.microsoft.com/sharepoint/v3" xsi:nil="true"/>
-  </documentManagement>
-</p:properties>
-</file>
-
-<file path=customXml/item4.xml><?xml version="1.0" encoding="utf-8"?>
-<b:Sources xmlns:b="http://schemas.openxmlformats.org/officeDocument/2006/bibliography" xmlns="http://schemas.openxmlformats.org/officeDocument/2006/bibliography" SelectedStyle="\APASixthEditionOfficeOnline.xsl" StyleName="APA Sixth Edition"/>
-</file>
-
 <file path=customXml/itemProps1.xml><?xml version="1.0" encoding="utf-8"?>
 <ds:datastoreItem xmlns:ds="http://schemas.openxmlformats.org/officeDocument/2006/customXml" ds:itemID="{D15CCAEE-6DD5-47C0-BE95-D420BE8AC255}">
   <ds:schemaRefs>
@@ -28917,6 +28469,26 @@
 </file>
 
 <file path=customXml/itemProps2.xml><?xml version="1.0" encoding="utf-8"?>
+<ds:datastoreItem xmlns:ds="http://schemas.openxmlformats.org/officeDocument/2006/customXml" ds:itemID="{0EB92B21-1AB6-439A-B6D4-9AFA8ACC5301}">
+  <ds:schemaRefs>
+    <ds:schemaRef ds:uri="http://schemas.openxmlformats.org/officeDocument/2006/bibliography"/>
+  </ds:schemaRefs>
+</ds:datastoreItem>
+</file>
+
+<file path=customXml/itemProps3.xml><?xml version="1.0" encoding="utf-8"?>
+<ds:datastoreItem xmlns:ds="http://schemas.openxmlformats.org/officeDocument/2006/customXml" ds:itemID="{6EB79E9C-F628-4EFE-9291-3EF6FD3A9320}">
+  <ds:schemaRefs>
+    <ds:schemaRef ds:uri="http://schemas.microsoft.com/office/2006/metadata/properties"/>
+    <ds:schemaRef ds:uri="http://schemas.microsoft.com/office/infopath/2007/PartnerControls"/>
+    <ds:schemaRef ds:uri="b03f722e-823d-4c29-84d1-8c55babf561e"/>
+    <ds:schemaRef ds:uri="611838d7-16b7-40e6-873b-7ca3491b508c"/>
+    <ds:schemaRef ds:uri="http://schemas.microsoft.com/sharepoint/v3"/>
+  </ds:schemaRefs>
+</ds:datastoreItem>
+</file>
+
+<file path=customXml/itemProps4.xml><?xml version="1.0" encoding="utf-8"?>
 <ds:datastoreItem xmlns:ds="http://schemas.openxmlformats.org/officeDocument/2006/customXml" ds:itemID="{62A6B6C7-178A-42F2-9DBA-9701BDB485B5}">
   <ds:schemaRefs>
     <ds:schemaRef ds:uri="http://schemas.microsoft.com/office/2006/metadata/contentType"/>
@@ -28934,24 +28506,4 @@
     <ds:schemaRef ds:uri="http://schemas.microsoft.com/internal/obd"/>
   </ds:schemaRefs>
 </ds:datastoreItem>
-</file>
-
-<file path=customXml/itemProps3.xml><?xml version="1.0" encoding="utf-8"?>
-<ds:datastoreItem xmlns:ds="http://schemas.openxmlformats.org/officeDocument/2006/customXml" ds:itemID="{6EB79E9C-F628-4EFE-9291-3EF6FD3A9320}">
-  <ds:schemaRefs>
-    <ds:schemaRef ds:uri="http://schemas.microsoft.com/office/2006/metadata/properties"/>
-    <ds:schemaRef ds:uri="http://schemas.microsoft.com/office/infopath/2007/PartnerControls"/>
-    <ds:schemaRef ds:uri="b03f722e-823d-4c29-84d1-8c55babf561e"/>
-    <ds:schemaRef ds:uri="611838d7-16b7-40e6-873b-7ca3491b508c"/>
-    <ds:schemaRef ds:uri="http://schemas.microsoft.com/sharepoint/v3"/>
-  </ds:schemaRefs>
-</ds:datastoreItem>
-</file>
-
-<file path=customXml/itemProps4.xml><?xml version="1.0" encoding="utf-8"?>
-<ds:datastoreItem xmlns:ds="http://schemas.openxmlformats.org/officeDocument/2006/customXml" ds:itemID="{0EB92B21-1AB6-439A-B6D4-9AFA8ACC5301}">
-  <ds:schemaRefs>
-    <ds:schemaRef ds:uri="http://schemas.openxmlformats.org/officeDocument/2006/bibliography"/>
-  </ds:schemaRefs>
-</ds:datastoreItem>
 </file>
</xml_diff>